<commit_message>
update room coordinates and test on problem generator
</commit_message>
<xml_diff>
--- a/src/smart_energy_management_robot/Images/development stages.docx
+++ b/src/smart_energy_management_robot/Images/development stages.docx
@@ -2,7 +2,1376 @@
 <file path=word/document.xml><?xml version="1.0" encoding="utf-8"?>
 <w:document xmlns:wpc="http://schemas.microsoft.com/office/word/2010/wordprocessingCanvas" xmlns:cx="http://schemas.microsoft.com/office/drawing/2014/chartex" xmlns:cx1="http://schemas.microsoft.com/office/drawing/2015/9/8/chartex" xmlns:cx2="http://schemas.microsoft.com/office/drawing/2015/10/21/chartex" xmlns:cx3="http://schemas.microsoft.com/office/drawing/2016/5/9/chartex" xmlns:cx4="http://schemas.microsoft.com/office/drawing/2016/5/10/chartex" xmlns:cx5="http://schemas.microsoft.com/office/drawing/2016/5/11/chartex" xmlns:cx6="http://schemas.microsoft.com/office/drawing/2016/5/12/chartex" xmlns:cx7="http://schemas.microsoft.com/office/drawing/2016/5/13/chartex" xmlns:cx8="http://schemas.microsoft.com/office/drawing/2016/5/14/chartex" xmlns:mc="http://schemas.openxmlformats.org/markup-compatibility/2006" xmlns:aink="http://schemas.microsoft.com/office/drawing/2016/ink" xmlns:am3d="http://schemas.microsoft.com/office/drawing/2017/model3d" xmlns:o="urn:schemas-microsoft-com:office:office" xmlns:oel="http://schemas.microsoft.com/office/2019/extlst" xmlns:r="http://schemas.openxmlformats.org/officeDocument/2006/relationships" xmlns:m="http://schemas.openxmlformats.org/officeDocument/2006/math" xmlns:v="urn:schemas-microsoft-com:vml" xmlns:wp14="http://schemas.microsoft.com/office/word/2010/wordprocessingDrawing" xmlns:wp="http://schemas.openxmlformats.org/drawingml/2006/wordprocessingDrawing" xmlns:w10="urn:schemas-microsoft-com:office:word" xmlns:w="http://schemas.openxmlformats.org/wordprocessingml/2006/main" xmlns:w14="http://schemas.microsoft.com/office/word/2010/wordml" xmlns:w15="http://schemas.microsoft.com/office/word/2012/wordml" xmlns:w16cex="http://schemas.microsoft.com/office/word/2018/wordml/cex" xmlns:w16cid="http://schemas.microsoft.com/office/word/2016/wordml/cid" xmlns:w16="http://schemas.microsoft.com/office/word/2018/wordml" xmlns:w16du="http://schemas.microsoft.com/office/word/2023/wordml/word16du" xmlns:w16sdtdh="http://schemas.microsoft.com/office/word/2020/wordml/sdtdatahash" xmlns:w16sdtfl="http://schemas.microsoft.com/office/word/2024/wordml/sdtformatlock" xmlns:w16se="http://schemas.microsoft.com/office/word/2015/wordml/symex" xmlns:wpg="http://schemas.microsoft.com/office/word/2010/wordprocessingGroup" xmlns:wpi="http://schemas.microsoft.com/office/word/2010/wordprocessingInk" xmlns:wne="http://schemas.microsoft.com/office/word/2006/wordml" xmlns:wps="http://schemas.microsoft.com/office/word/2010/wordprocessingShape" mc:Ignorable="w14 w15 w16se w16cid w16 w16cex w16sdtdh w16sdtfl w16du wp14">
   <w:body>
+    <w:p>
+      <w:pPr>
+        <w:rPr>
+          <w:lang w:val="fr-FR"/>
+        </w:rPr>
+      </w:pPr>
+      <w:r>
+        <w:rPr>
+          <w:lang w:val="fr-FR"/>
+        </w:rPr>
+        <w:t>Odom positions</w:t>
+      </w:r>
+    </w:p>
+    <w:p>
+      <w:pPr>
+        <w:rPr>
+          <w:b/>
+          <w:bCs/>
+          <w:lang w:val="fr-FR"/>
+        </w:rPr>
+      </w:pPr>
+      <w:proofErr w:type="spellStart"/>
+      <w:r>
+        <w:rPr>
+          <w:b/>
+          <w:bCs/>
+          <w:lang w:val="fr-FR"/>
+        </w:rPr>
+        <w:t>B</w:t>
+      </w:r>
+      <w:r>
+        <w:rPr>
+          <w:b/>
+          <w:bCs/>
+          <w:lang w:val="fr-FR"/>
+        </w:rPr>
+        <w:t>athroom</w:t>
+      </w:r>
+      <w:proofErr w:type="spellEnd"/>
+    </w:p>
+    <w:p>
+      <w:pPr>
+        <w:rPr>
+          <w:lang w:val="fr-FR"/>
+        </w:rPr>
+      </w:pPr>
+      <w:proofErr w:type="gramStart"/>
+      <w:r>
+        <w:rPr>
+          <w:lang w:val="fr-FR"/>
+        </w:rPr>
+        <w:t>pose:</w:t>
+      </w:r>
+      <w:proofErr w:type="gramEnd"/>
+    </w:p>
+    <w:p>
+      <w:pPr>
+        <w:rPr>
+          <w:lang w:val="fr-FR"/>
+        </w:rPr>
+      </w:pPr>
+      <w:r>
+        <w:rPr>
+          <w:lang w:val="fr-FR"/>
+        </w:rPr>
+        <w:t xml:space="preserve">    </w:t>
+      </w:r>
+      <w:proofErr w:type="gramStart"/>
+      <w:r>
+        <w:rPr>
+          <w:lang w:val="fr-FR"/>
+        </w:rPr>
+        <w:t>position:</w:t>
+      </w:r>
+      <w:proofErr w:type="gramEnd"/>
+    </w:p>
+    <w:p>
+      <w:pPr>
+        <w:rPr>
+          <w:lang w:val="fr-FR"/>
+        </w:rPr>
+      </w:pPr>
+      <w:r>
+        <w:rPr>
+          <w:lang w:val="fr-FR"/>
+        </w:rPr>
+        <w:t xml:space="preserve">      </w:t>
+      </w:r>
+      <w:proofErr w:type="gramStart"/>
+      <w:r>
+        <w:rPr>
+          <w:lang w:val="fr-FR"/>
+        </w:rPr>
+        <w:t>x:</w:t>
+      </w:r>
+      <w:proofErr w:type="gramEnd"/>
+      <w:r>
+        <w:rPr>
+          <w:lang w:val="fr-FR"/>
+        </w:rPr>
+        <w:t xml:space="preserve"> 6.424454852222057</w:t>
+      </w:r>
+    </w:p>
+    <w:p>
+      <w:pPr>
+        <w:rPr>
+          <w:lang w:val="fr-FR"/>
+        </w:rPr>
+      </w:pPr>
+      <w:r>
+        <w:rPr>
+          <w:lang w:val="fr-FR"/>
+        </w:rPr>
+        <w:t xml:space="preserve">      </w:t>
+      </w:r>
+      <w:proofErr w:type="gramStart"/>
+      <w:r>
+        <w:rPr>
+          <w:lang w:val="fr-FR"/>
+        </w:rPr>
+        <w:t>y:</w:t>
+      </w:r>
+      <w:proofErr w:type="gramEnd"/>
+      <w:r>
+        <w:rPr>
+          <w:lang w:val="fr-FR"/>
+        </w:rPr>
+        <w:t xml:space="preserve"> -2.7621221182314986</w:t>
+      </w:r>
+    </w:p>
+    <w:p>
+      <w:pPr>
+        <w:rPr>
+          <w:lang w:val="fr-FR"/>
+        </w:rPr>
+      </w:pPr>
+      <w:r>
+        <w:rPr>
+          <w:lang w:val="fr-FR"/>
+        </w:rPr>
+        <w:t xml:space="preserve">      </w:t>
+      </w:r>
+      <w:proofErr w:type="gramStart"/>
+      <w:r>
+        <w:rPr>
+          <w:lang w:val="fr-FR"/>
+        </w:rPr>
+        <w:t>z:</w:t>
+      </w:r>
+      <w:proofErr w:type="gramEnd"/>
+      <w:r>
+        <w:rPr>
+          <w:lang w:val="fr-FR"/>
+        </w:rPr>
+        <w:t xml:space="preserve"> 0.008529054881414188</w:t>
+      </w:r>
+    </w:p>
+    <w:p>
+      <w:pPr>
+        <w:rPr>
+          <w:lang w:val="fr-FR"/>
+        </w:rPr>
+      </w:pPr>
+      <w:r>
+        <w:rPr>
+          <w:lang w:val="fr-FR"/>
+        </w:rPr>
+        <w:drawing>
+          <wp:inline distT="0" distB="0" distL="0" distR="0" wp14:anchorId="7636303E" wp14:editId="34ADD621">
+            <wp:extent cx="5731510" cy="2784475"/>
+            <wp:effectExtent l="0" t="0" r="2540" b="0"/>
+            <wp:docPr id="595895438" name="Picture 1"/>
+            <wp:cNvGraphicFramePr>
+              <a:graphicFrameLocks xmlns:a="http://schemas.openxmlformats.org/drawingml/2006/main" noChangeAspect="1"/>
+            </wp:cNvGraphicFramePr>
+            <a:graphic xmlns:a="http://schemas.openxmlformats.org/drawingml/2006/main">
+              <a:graphicData uri="http://schemas.openxmlformats.org/drawingml/2006/picture">
+                <pic:pic xmlns:pic="http://schemas.openxmlformats.org/drawingml/2006/picture">
+                  <pic:nvPicPr>
+                    <pic:cNvPr id="595895438" name=""/>
+                    <pic:cNvPicPr/>
+                  </pic:nvPicPr>
+                  <pic:blipFill>
+                    <a:blip r:embed="rId4"/>
+                    <a:stretch>
+                      <a:fillRect/>
+                    </a:stretch>
+                  </pic:blipFill>
+                  <pic:spPr>
+                    <a:xfrm>
+                      <a:off x="0" y="0"/>
+                      <a:ext cx="5731510" cy="2784475"/>
+                    </a:xfrm>
+                    <a:prstGeom prst="rect">
+                      <a:avLst/>
+                    </a:prstGeom>
+                  </pic:spPr>
+                </pic:pic>
+              </a:graphicData>
+            </a:graphic>
+          </wp:inline>
+        </w:drawing>
+      </w:r>
+    </w:p>
+    <w:p>
+      <w:pPr>
+        <w:rPr>
+          <w:lang w:val="fr-FR"/>
+        </w:rPr>
+      </w:pPr>
+    </w:p>
+    <w:p>
+      <w:pPr>
+        <w:rPr>
+          <w:b/>
+          <w:bCs/>
+          <w:lang w:val="fr-FR"/>
+        </w:rPr>
+      </w:pPr>
+      <w:r>
+        <w:rPr>
+          <w:b/>
+          <w:bCs/>
+          <w:lang w:val="fr-FR"/>
+        </w:rPr>
+        <w:t>Entrance</w:t>
+      </w:r>
+    </w:p>
+    <w:p>
+      <w:pPr>
+        <w:rPr>
+          <w:lang w:val="fr-FR"/>
+        </w:rPr>
+      </w:pPr>
+      <w:proofErr w:type="gramStart"/>
+      <w:r>
+        <w:rPr>
+          <w:lang w:val="fr-FR"/>
+        </w:rPr>
+        <w:t>pose:</w:t>
+      </w:r>
+      <w:proofErr w:type="gramEnd"/>
+    </w:p>
+    <w:p>
+      <w:pPr>
+        <w:rPr>
+          <w:lang w:val="fr-FR"/>
+        </w:rPr>
+      </w:pPr>
+      <w:r>
+        <w:rPr>
+          <w:lang w:val="fr-FR"/>
+        </w:rPr>
+        <w:t xml:space="preserve">    </w:t>
+      </w:r>
+      <w:proofErr w:type="gramStart"/>
+      <w:r>
+        <w:rPr>
+          <w:lang w:val="fr-FR"/>
+        </w:rPr>
+        <w:t>position:</w:t>
+      </w:r>
+      <w:proofErr w:type="gramEnd"/>
+    </w:p>
+    <w:p>
+      <w:pPr>
+        <w:rPr>
+          <w:lang w:val="fr-FR"/>
+        </w:rPr>
+      </w:pPr>
+      <w:r>
+        <w:rPr>
+          <w:lang w:val="fr-FR"/>
+        </w:rPr>
+        <w:t xml:space="preserve">      </w:t>
+      </w:r>
+      <w:proofErr w:type="gramStart"/>
+      <w:r>
+        <w:rPr>
+          <w:lang w:val="fr-FR"/>
+        </w:rPr>
+        <w:t>x:</w:t>
+      </w:r>
+      <w:proofErr w:type="gramEnd"/>
+      <w:r>
+        <w:rPr>
+          <w:lang w:val="fr-FR"/>
+        </w:rPr>
+        <w:t xml:space="preserve"> -0.013661333992237951</w:t>
+      </w:r>
+    </w:p>
+    <w:p>
+      <w:pPr>
+        <w:rPr>
+          <w:lang w:val="fr-FR"/>
+        </w:rPr>
+      </w:pPr>
+      <w:r>
+        <w:rPr>
+          <w:lang w:val="fr-FR"/>
+        </w:rPr>
+        <w:t xml:space="preserve">      </w:t>
+      </w:r>
+      <w:proofErr w:type="gramStart"/>
+      <w:r>
+        <w:rPr>
+          <w:lang w:val="fr-FR"/>
+        </w:rPr>
+        <w:t>y:</w:t>
+      </w:r>
+      <w:proofErr w:type="gramEnd"/>
+      <w:r>
+        <w:rPr>
+          <w:lang w:val="fr-FR"/>
+        </w:rPr>
+        <w:t xml:space="preserve"> -2.9135969274880207</w:t>
+      </w:r>
+    </w:p>
+    <w:p>
+      <w:pPr>
+        <w:rPr>
+          <w:lang w:val="fr-FR"/>
+        </w:rPr>
+      </w:pPr>
+      <w:r>
+        <w:rPr>
+          <w:lang w:val="fr-FR"/>
+        </w:rPr>
+        <w:t xml:space="preserve">      </w:t>
+      </w:r>
+      <w:proofErr w:type="gramStart"/>
+      <w:r>
+        <w:rPr>
+          <w:lang w:val="fr-FR"/>
+        </w:rPr>
+        <w:t>z:</w:t>
+      </w:r>
+      <w:proofErr w:type="gramEnd"/>
+      <w:r>
+        <w:rPr>
+          <w:lang w:val="fr-FR"/>
+        </w:rPr>
+        <w:t xml:space="preserve"> 0.008527314746870397</w:t>
+      </w:r>
+    </w:p>
+    <w:p>
+      <w:pPr>
+        <w:rPr>
+          <w:lang w:val="fr-FR"/>
+        </w:rPr>
+      </w:pPr>
+      <w:r>
+        <w:rPr>
+          <w:lang w:val="fr-FR"/>
+        </w:rPr>
+        <w:lastRenderedPageBreak/>
+        <w:drawing>
+          <wp:inline distT="0" distB="0" distL="0" distR="0" wp14:anchorId="6C2A0586" wp14:editId="465ABB8A">
+            <wp:extent cx="5731510" cy="2644775"/>
+            <wp:effectExtent l="0" t="0" r="2540" b="3175"/>
+            <wp:docPr id="1412350459" name="Picture 1"/>
+            <wp:cNvGraphicFramePr>
+              <a:graphicFrameLocks xmlns:a="http://schemas.openxmlformats.org/drawingml/2006/main" noChangeAspect="1"/>
+            </wp:cNvGraphicFramePr>
+            <a:graphic xmlns:a="http://schemas.openxmlformats.org/drawingml/2006/main">
+              <a:graphicData uri="http://schemas.openxmlformats.org/drawingml/2006/picture">
+                <pic:pic xmlns:pic="http://schemas.openxmlformats.org/drawingml/2006/picture">
+                  <pic:nvPicPr>
+                    <pic:cNvPr id="1412350459" name=""/>
+                    <pic:cNvPicPr/>
+                  </pic:nvPicPr>
+                  <pic:blipFill>
+                    <a:blip r:embed="rId5"/>
+                    <a:stretch>
+                      <a:fillRect/>
+                    </a:stretch>
+                  </pic:blipFill>
+                  <pic:spPr>
+                    <a:xfrm>
+                      <a:off x="0" y="0"/>
+                      <a:ext cx="5731510" cy="2644775"/>
+                    </a:xfrm>
+                    <a:prstGeom prst="rect">
+                      <a:avLst/>
+                    </a:prstGeom>
+                  </pic:spPr>
+                </pic:pic>
+              </a:graphicData>
+            </a:graphic>
+          </wp:inline>
+        </w:drawing>
+      </w:r>
+    </w:p>
+    <w:p>
+      <w:pPr>
+        <w:rPr>
+          <w:lang w:val="fr-FR"/>
+        </w:rPr>
+      </w:pPr>
+    </w:p>
+    <w:p>
+      <w:pPr>
+        <w:rPr>
+          <w:lang w:val="fr-FR"/>
+        </w:rPr>
+      </w:pPr>
+      <w:proofErr w:type="spellStart"/>
+      <w:r>
+        <w:rPr>
+          <w:b/>
+          <w:bCs/>
+          <w:lang w:val="fr-FR"/>
+        </w:rPr>
+        <w:t>Bedroom</w:t>
+      </w:r>
+      <w:proofErr w:type="spellEnd"/>
+      <w:r>
+        <w:rPr>
+          <w:lang w:val="fr-FR"/>
+        </w:rPr>
+        <w:t xml:space="preserve"> </w:t>
+      </w:r>
+    </w:p>
+    <w:p>
+      <w:pPr>
+        <w:rPr>
+          <w:lang w:val="fr-FR"/>
+        </w:rPr>
+      </w:pPr>
+      <w:proofErr w:type="gramStart"/>
+      <w:r>
+        <w:rPr>
+          <w:lang w:val="fr-FR"/>
+        </w:rPr>
+        <w:t>pose:</w:t>
+      </w:r>
+      <w:proofErr w:type="gramEnd"/>
+    </w:p>
+    <w:p>
+      <w:pPr>
+        <w:rPr>
+          <w:lang w:val="fr-FR"/>
+        </w:rPr>
+      </w:pPr>
+      <w:r>
+        <w:rPr>
+          <w:lang w:val="fr-FR"/>
+        </w:rPr>
+        <w:t xml:space="preserve">    </w:t>
+      </w:r>
+      <w:proofErr w:type="gramStart"/>
+      <w:r>
+        <w:rPr>
+          <w:lang w:val="fr-FR"/>
+        </w:rPr>
+        <w:t>position:</w:t>
+      </w:r>
+      <w:proofErr w:type="gramEnd"/>
+    </w:p>
+    <w:p>
+      <w:pPr>
+        <w:rPr>
+          <w:lang w:val="fr-FR"/>
+        </w:rPr>
+      </w:pPr>
+      <w:r>
+        <w:rPr>
+          <w:lang w:val="fr-FR"/>
+        </w:rPr>
+        <w:t xml:space="preserve">      </w:t>
+      </w:r>
+      <w:proofErr w:type="gramStart"/>
+      <w:r>
+        <w:rPr>
+          <w:lang w:val="fr-FR"/>
+        </w:rPr>
+        <w:t>x:</w:t>
+      </w:r>
+      <w:proofErr w:type="gramEnd"/>
+      <w:r>
+        <w:rPr>
+          <w:lang w:val="fr-FR"/>
+        </w:rPr>
+        <w:t xml:space="preserve"> 3.102349175728345</w:t>
+      </w:r>
+    </w:p>
+    <w:p>
+      <w:pPr>
+        <w:rPr>
+          <w:lang w:val="fr-FR"/>
+        </w:rPr>
+      </w:pPr>
+      <w:r>
+        <w:rPr>
+          <w:lang w:val="fr-FR"/>
+        </w:rPr>
+        <w:t xml:space="preserve">      </w:t>
+      </w:r>
+      <w:proofErr w:type="gramStart"/>
+      <w:r>
+        <w:rPr>
+          <w:lang w:val="fr-FR"/>
+        </w:rPr>
+        <w:t>y:</w:t>
+      </w:r>
+      <w:proofErr w:type="gramEnd"/>
+      <w:r>
+        <w:rPr>
+          <w:lang w:val="fr-FR"/>
+        </w:rPr>
+        <w:t xml:space="preserve"> 2.6026055665080365</w:t>
+      </w:r>
+    </w:p>
+    <w:p>
+      <w:pPr>
+        <w:rPr>
+          <w:lang w:val="fr-FR"/>
+        </w:rPr>
+      </w:pPr>
+      <w:r>
+        <w:rPr>
+          <w:lang w:val="fr-FR"/>
+        </w:rPr>
+        <w:t xml:space="preserve">      </w:t>
+      </w:r>
+      <w:proofErr w:type="gramStart"/>
+      <w:r>
+        <w:rPr>
+          <w:lang w:val="fr-FR"/>
+        </w:rPr>
+        <w:t>z:</w:t>
+      </w:r>
+      <w:proofErr w:type="gramEnd"/>
+      <w:r>
+        <w:rPr>
+          <w:lang w:val="fr-FR"/>
+        </w:rPr>
+        <w:t xml:space="preserve"> 0.008530519746516252</w:t>
+      </w:r>
+    </w:p>
+    <w:p>
+      <w:pPr>
+        <w:rPr>
+          <w:lang w:val="fr-FR"/>
+        </w:rPr>
+      </w:pPr>
+      <w:r>
+        <w:rPr>
+          <w:lang w:val="fr-FR"/>
+        </w:rPr>
+        <w:drawing>
+          <wp:inline distT="0" distB="0" distL="0" distR="0" wp14:anchorId="64AEE744" wp14:editId="058D3589">
+            <wp:extent cx="5731510" cy="2903220"/>
+            <wp:effectExtent l="0" t="0" r="2540" b="0"/>
+            <wp:docPr id="2098101847" name="Picture 1"/>
+            <wp:cNvGraphicFramePr>
+              <a:graphicFrameLocks xmlns:a="http://schemas.openxmlformats.org/drawingml/2006/main" noChangeAspect="1"/>
+            </wp:cNvGraphicFramePr>
+            <a:graphic xmlns:a="http://schemas.openxmlformats.org/drawingml/2006/main">
+              <a:graphicData uri="http://schemas.openxmlformats.org/drawingml/2006/picture">
+                <pic:pic xmlns:pic="http://schemas.openxmlformats.org/drawingml/2006/picture">
+                  <pic:nvPicPr>
+                    <pic:cNvPr id="2098101847" name=""/>
+                    <pic:cNvPicPr/>
+                  </pic:nvPicPr>
+                  <pic:blipFill>
+                    <a:blip r:embed="rId6"/>
+                    <a:stretch>
+                      <a:fillRect/>
+                    </a:stretch>
+                  </pic:blipFill>
+                  <pic:spPr>
+                    <a:xfrm>
+                      <a:off x="0" y="0"/>
+                      <a:ext cx="5731510" cy="2903220"/>
+                    </a:xfrm>
+                    <a:prstGeom prst="rect">
+                      <a:avLst/>
+                    </a:prstGeom>
+                  </pic:spPr>
+                </pic:pic>
+              </a:graphicData>
+            </a:graphic>
+          </wp:inline>
+        </w:drawing>
+      </w:r>
+    </w:p>
+    <w:p>
+      <w:pPr>
+        <w:rPr>
+          <w:b/>
+          <w:bCs/>
+          <w:lang w:val="fr-FR"/>
+        </w:rPr>
+      </w:pPr>
+    </w:p>
+    <w:p>
+      <w:pPr>
+        <w:rPr>
+          <w:b/>
+          <w:bCs/>
+          <w:lang w:val="fr-FR"/>
+        </w:rPr>
+      </w:pPr>
+    </w:p>
+    <w:p>
+      <w:pPr>
+        <w:rPr>
+          <w:b/>
+          <w:bCs/>
+          <w:lang w:val="fr-FR"/>
+        </w:rPr>
+      </w:pPr>
+    </w:p>
+    <w:p>
+      <w:pPr>
+        <w:rPr>
+          <w:b/>
+          <w:bCs/>
+          <w:lang w:val="fr-FR"/>
+        </w:rPr>
+      </w:pPr>
+      <w:r>
+        <w:rPr>
+          <w:b/>
+          <w:bCs/>
+          <w:lang w:val="fr-FR"/>
+        </w:rPr>
+        <w:lastRenderedPageBreak/>
+        <w:t>Kitchen</w:t>
+      </w:r>
+    </w:p>
+    <w:p>
+      <w:pPr>
+        <w:rPr>
+          <w:lang w:val="fr-FR"/>
+        </w:rPr>
+      </w:pPr>
+      <w:proofErr w:type="gramStart"/>
+      <w:r>
+        <w:rPr>
+          <w:lang w:val="fr-FR"/>
+        </w:rPr>
+        <w:t>pose:</w:t>
+      </w:r>
+      <w:proofErr w:type="gramEnd"/>
+    </w:p>
+    <w:p>
+      <w:pPr>
+        <w:rPr>
+          <w:lang w:val="fr-FR"/>
+        </w:rPr>
+      </w:pPr>
+      <w:r>
+        <w:rPr>
+          <w:lang w:val="fr-FR"/>
+        </w:rPr>
+        <w:t xml:space="preserve">    </w:t>
+      </w:r>
+      <w:proofErr w:type="gramStart"/>
+      <w:r>
+        <w:rPr>
+          <w:lang w:val="fr-FR"/>
+        </w:rPr>
+        <w:t>position:</w:t>
+      </w:r>
+      <w:proofErr w:type="gramEnd"/>
+    </w:p>
+    <w:p>
+      <w:pPr>
+        <w:rPr>
+          <w:lang w:val="fr-FR"/>
+        </w:rPr>
+      </w:pPr>
+      <w:r>
+        <w:rPr>
+          <w:lang w:val="fr-FR"/>
+        </w:rPr>
+        <w:t xml:space="preserve">      </w:t>
+      </w:r>
+      <w:proofErr w:type="gramStart"/>
+      <w:r>
+        <w:rPr>
+          <w:lang w:val="fr-FR"/>
+        </w:rPr>
+        <w:t>x:</w:t>
+      </w:r>
+      <w:proofErr w:type="gramEnd"/>
+      <w:r>
+        <w:rPr>
+          <w:lang w:val="fr-FR"/>
+        </w:rPr>
+        <w:t xml:space="preserve"> -6.463428450195252</w:t>
+      </w:r>
+    </w:p>
+    <w:p>
+      <w:pPr>
+        <w:rPr>
+          <w:lang w:val="fr-FR"/>
+        </w:rPr>
+      </w:pPr>
+      <w:r>
+        <w:rPr>
+          <w:lang w:val="fr-FR"/>
+        </w:rPr>
+        <w:t xml:space="preserve">      </w:t>
+      </w:r>
+      <w:proofErr w:type="gramStart"/>
+      <w:r>
+        <w:rPr>
+          <w:lang w:val="fr-FR"/>
+        </w:rPr>
+        <w:t>y:</w:t>
+      </w:r>
+      <w:proofErr w:type="gramEnd"/>
+      <w:r>
+        <w:rPr>
+          <w:lang w:val="fr-FR"/>
+        </w:rPr>
+        <w:t xml:space="preserve"> -1.5579466187278785</w:t>
+      </w:r>
+    </w:p>
+    <w:p>
+      <w:pPr>
+        <w:rPr>
+          <w:lang w:val="fr-FR"/>
+        </w:rPr>
+      </w:pPr>
+      <w:r>
+        <w:rPr>
+          <w:lang w:val="fr-FR"/>
+        </w:rPr>
+        <w:t xml:space="preserve">      </w:t>
+      </w:r>
+      <w:proofErr w:type="gramStart"/>
+      <w:r>
+        <w:rPr>
+          <w:lang w:val="fr-FR"/>
+        </w:rPr>
+        <w:t>z:</w:t>
+      </w:r>
+      <w:proofErr w:type="gramEnd"/>
+      <w:r>
+        <w:rPr>
+          <w:lang w:val="fr-FR"/>
+        </w:rPr>
+        <w:t xml:space="preserve"> 0.008528681804030441</w:t>
+      </w:r>
+    </w:p>
+    <w:p>
+      <w:pPr>
+        <w:rPr>
+          <w:lang w:val="fr-FR"/>
+        </w:rPr>
+      </w:pPr>
+      <w:r>
+        <w:rPr>
+          <w:lang w:val="fr-FR"/>
+        </w:rPr>
+        <w:drawing>
+          <wp:inline distT="0" distB="0" distL="0" distR="0" wp14:anchorId="7F688B5E" wp14:editId="47BA5A2E">
+            <wp:extent cx="5731510" cy="2513330"/>
+            <wp:effectExtent l="0" t="0" r="2540" b="1270"/>
+            <wp:docPr id="845865615" name="Picture 1"/>
+            <wp:cNvGraphicFramePr>
+              <a:graphicFrameLocks xmlns:a="http://schemas.openxmlformats.org/drawingml/2006/main" noChangeAspect="1"/>
+            </wp:cNvGraphicFramePr>
+            <a:graphic xmlns:a="http://schemas.openxmlformats.org/drawingml/2006/main">
+              <a:graphicData uri="http://schemas.openxmlformats.org/drawingml/2006/picture">
+                <pic:pic xmlns:pic="http://schemas.openxmlformats.org/drawingml/2006/picture">
+                  <pic:nvPicPr>
+                    <pic:cNvPr id="845865615" name=""/>
+                    <pic:cNvPicPr/>
+                  </pic:nvPicPr>
+                  <pic:blipFill>
+                    <a:blip r:embed="rId7"/>
+                    <a:stretch>
+                      <a:fillRect/>
+                    </a:stretch>
+                  </pic:blipFill>
+                  <pic:spPr>
+                    <a:xfrm>
+                      <a:off x="0" y="0"/>
+                      <a:ext cx="5731510" cy="2513330"/>
+                    </a:xfrm>
+                    <a:prstGeom prst="rect">
+                      <a:avLst/>
+                    </a:prstGeom>
+                  </pic:spPr>
+                </pic:pic>
+              </a:graphicData>
+            </a:graphic>
+          </wp:inline>
+        </w:drawing>
+      </w:r>
+    </w:p>
+    <w:p>
+      <w:pPr>
+        <w:rPr>
+          <w:b/>
+          <w:bCs/>
+          <w:lang w:val="fr-FR"/>
+        </w:rPr>
+      </w:pPr>
+      <w:proofErr w:type="spellStart"/>
+      <w:r>
+        <w:rPr>
+          <w:b/>
+          <w:bCs/>
+          <w:lang w:val="fr-FR"/>
+        </w:rPr>
+        <w:t>Balcony</w:t>
+      </w:r>
+      <w:proofErr w:type="spellEnd"/>
+    </w:p>
+    <w:p>
+      <w:pPr>
+        <w:rPr>
+          <w:lang w:val="fr-FR"/>
+        </w:rPr>
+      </w:pPr>
+      <w:proofErr w:type="gramStart"/>
+      <w:r>
+        <w:rPr>
+          <w:lang w:val="fr-FR"/>
+        </w:rPr>
+        <w:t>pose:</w:t>
+      </w:r>
+      <w:proofErr w:type="gramEnd"/>
+    </w:p>
+    <w:p>
+      <w:pPr>
+        <w:rPr>
+          <w:lang w:val="fr-FR"/>
+        </w:rPr>
+      </w:pPr>
+      <w:r>
+        <w:rPr>
+          <w:lang w:val="fr-FR"/>
+        </w:rPr>
+        <w:t xml:space="preserve">    </w:t>
+      </w:r>
+      <w:proofErr w:type="gramStart"/>
+      <w:r>
+        <w:rPr>
+          <w:lang w:val="fr-FR"/>
+        </w:rPr>
+        <w:t>position:</w:t>
+      </w:r>
+      <w:proofErr w:type="gramEnd"/>
+    </w:p>
+    <w:p>
+      <w:pPr>
+        <w:rPr>
+          <w:lang w:val="fr-FR"/>
+        </w:rPr>
+      </w:pPr>
+      <w:r>
+        <w:rPr>
+          <w:lang w:val="fr-FR"/>
+        </w:rPr>
+        <w:t xml:space="preserve">      </w:t>
+      </w:r>
+      <w:proofErr w:type="gramStart"/>
+      <w:r>
+        <w:rPr>
+          <w:lang w:val="fr-FR"/>
+        </w:rPr>
+        <w:t>x:</w:t>
+      </w:r>
+      <w:proofErr w:type="gramEnd"/>
+      <w:r>
+        <w:rPr>
+          <w:lang w:val="fr-FR"/>
+        </w:rPr>
+        <w:t xml:space="preserve"> -6.530455463277796</w:t>
+      </w:r>
+    </w:p>
+    <w:p>
+      <w:pPr>
+        <w:rPr>
+          <w:lang w:val="fr-FR"/>
+        </w:rPr>
+      </w:pPr>
+      <w:r>
+        <w:rPr>
+          <w:lang w:val="fr-FR"/>
+        </w:rPr>
+        <w:t xml:space="preserve">      </w:t>
+      </w:r>
+      <w:proofErr w:type="gramStart"/>
+      <w:r>
+        <w:rPr>
+          <w:lang w:val="fr-FR"/>
+        </w:rPr>
+        <w:t>y:</w:t>
+      </w:r>
+      <w:proofErr w:type="gramEnd"/>
+      <w:r>
+        <w:rPr>
+          <w:lang w:val="fr-FR"/>
+        </w:rPr>
+        <w:t xml:space="preserve"> 3.067749569887495</w:t>
+      </w:r>
+    </w:p>
+    <w:p>
+      <w:pPr>
+        <w:rPr>
+          <w:lang w:val="fr-FR"/>
+        </w:rPr>
+      </w:pPr>
+      <w:r>
+        <w:rPr>
+          <w:lang w:val="fr-FR"/>
+        </w:rPr>
+        <w:t xml:space="preserve">      </w:t>
+      </w:r>
+      <w:proofErr w:type="gramStart"/>
+      <w:r>
+        <w:rPr>
+          <w:lang w:val="fr-FR"/>
+        </w:rPr>
+        <w:t>z:</w:t>
+      </w:r>
+      <w:proofErr w:type="gramEnd"/>
+      <w:r>
+        <w:rPr>
+          <w:lang w:val="fr-FR"/>
+        </w:rPr>
+        <w:t xml:space="preserve"> 0.008532910172421972</w:t>
+      </w:r>
+    </w:p>
+    <w:p>
+      <w:pPr>
+        <w:rPr>
+          <w:lang w:val="fr-FR"/>
+        </w:rPr>
+      </w:pPr>
+      <w:r>
+        <w:rPr>
+          <w:lang w:val="fr-FR"/>
+        </w:rPr>
+        <w:lastRenderedPageBreak/>
+        <w:drawing>
+          <wp:inline distT="0" distB="0" distL="0" distR="0" wp14:anchorId="352FCD31" wp14:editId="77283D5C">
+            <wp:extent cx="5731510" cy="2594610"/>
+            <wp:effectExtent l="0" t="0" r="2540" b="0"/>
+            <wp:docPr id="48032244" name="Picture 1"/>
+            <wp:cNvGraphicFramePr>
+              <a:graphicFrameLocks xmlns:a="http://schemas.openxmlformats.org/drawingml/2006/main" noChangeAspect="1"/>
+            </wp:cNvGraphicFramePr>
+            <a:graphic xmlns:a="http://schemas.openxmlformats.org/drawingml/2006/main">
+              <a:graphicData uri="http://schemas.openxmlformats.org/drawingml/2006/picture">
+                <pic:pic xmlns:pic="http://schemas.openxmlformats.org/drawingml/2006/picture">
+                  <pic:nvPicPr>
+                    <pic:cNvPr id="48032244" name=""/>
+                    <pic:cNvPicPr/>
+                  </pic:nvPicPr>
+                  <pic:blipFill>
+                    <a:blip r:embed="rId8"/>
+                    <a:stretch>
+                      <a:fillRect/>
+                    </a:stretch>
+                  </pic:blipFill>
+                  <pic:spPr>
+                    <a:xfrm>
+                      <a:off x="0" y="0"/>
+                      <a:ext cx="5731510" cy="2594610"/>
+                    </a:xfrm>
+                    <a:prstGeom prst="rect">
+                      <a:avLst/>
+                    </a:prstGeom>
+                  </pic:spPr>
+                </pic:pic>
+              </a:graphicData>
+            </a:graphic>
+          </wp:inline>
+        </w:drawing>
+      </w:r>
+    </w:p>
+    <w:p>
+      <w:pPr>
+        <w:rPr>
+          <w:b/>
+          <w:bCs/>
+          <w:lang w:val="fr-FR"/>
+        </w:rPr>
+      </w:pPr>
+      <w:r>
+        <w:rPr>
+          <w:b/>
+          <w:bCs/>
+          <w:lang w:val="fr-FR"/>
+        </w:rPr>
+        <w:t>Living Room</w:t>
+      </w:r>
+    </w:p>
+    <w:p>
+      <w:pPr>
+        <w:rPr>
+          <w:lang w:val="fr-FR"/>
+        </w:rPr>
+      </w:pPr>
+      <w:proofErr w:type="gramStart"/>
+      <w:r>
+        <w:rPr>
+          <w:lang w:val="fr-FR"/>
+        </w:rPr>
+        <w:t>pose:</w:t>
+      </w:r>
+      <w:proofErr w:type="gramEnd"/>
+    </w:p>
+    <w:p>
+      <w:pPr>
+        <w:rPr>
+          <w:lang w:val="fr-FR"/>
+        </w:rPr>
+      </w:pPr>
+      <w:r>
+        <w:rPr>
+          <w:lang w:val="fr-FR"/>
+        </w:rPr>
+        <w:t xml:space="preserve">    </w:t>
+      </w:r>
+      <w:proofErr w:type="gramStart"/>
+      <w:r>
+        <w:rPr>
+          <w:lang w:val="fr-FR"/>
+        </w:rPr>
+        <w:t>position:</w:t>
+      </w:r>
+      <w:proofErr w:type="gramEnd"/>
+    </w:p>
+    <w:p>
+      <w:pPr>
+        <w:rPr>
+          <w:lang w:val="fr-FR"/>
+        </w:rPr>
+      </w:pPr>
+      <w:r>
+        <w:rPr>
+          <w:lang w:val="fr-FR"/>
+        </w:rPr>
+        <w:t xml:space="preserve">      </w:t>
+      </w:r>
+      <w:proofErr w:type="gramStart"/>
+      <w:r>
+        <w:rPr>
+          <w:lang w:val="fr-FR"/>
+        </w:rPr>
+        <w:t>x:</w:t>
+      </w:r>
+      <w:proofErr w:type="gramEnd"/>
+      <w:r>
+        <w:rPr>
+          <w:lang w:val="fr-FR"/>
+        </w:rPr>
+        <w:t xml:space="preserve"> -2.8408943168160468</w:t>
+      </w:r>
+    </w:p>
+    <w:p>
+      <w:pPr>
+        <w:rPr>
+          <w:lang w:val="fr-FR"/>
+        </w:rPr>
+      </w:pPr>
+      <w:r>
+        <w:rPr>
+          <w:lang w:val="fr-FR"/>
+        </w:rPr>
+        <w:t xml:space="preserve">      </w:t>
+      </w:r>
+      <w:proofErr w:type="gramStart"/>
+      <w:r>
+        <w:rPr>
+          <w:lang w:val="fr-FR"/>
+        </w:rPr>
+        <w:t>y:</w:t>
+      </w:r>
+      <w:proofErr w:type="gramEnd"/>
+      <w:r>
+        <w:rPr>
+          <w:lang w:val="fr-FR"/>
+        </w:rPr>
+        <w:t xml:space="preserve"> 3.083495636546196</w:t>
+      </w:r>
+    </w:p>
+    <w:p>
+      <w:pPr>
+        <w:rPr>
+          <w:lang w:val="fr-FR"/>
+        </w:rPr>
+      </w:pPr>
+      <w:r>
+        <w:rPr>
+          <w:lang w:val="fr-FR"/>
+        </w:rPr>
+        <w:t xml:space="preserve">      </w:t>
+      </w:r>
+      <w:proofErr w:type="gramStart"/>
+      <w:r>
+        <w:rPr>
+          <w:lang w:val="fr-FR"/>
+        </w:rPr>
+        <w:t>z:</w:t>
+      </w:r>
+      <w:proofErr w:type="gramEnd"/>
+      <w:r>
+        <w:rPr>
+          <w:lang w:val="fr-FR"/>
+        </w:rPr>
+        <w:t xml:space="preserve"> 0.008529542914335803</w:t>
+      </w:r>
+    </w:p>
+    <w:p>
+      <w:pPr>
+        <w:rPr>
+          <w:lang w:val="fr-FR"/>
+        </w:rPr>
+      </w:pPr>
+      <w:r>
+        <w:rPr>
+          <w:lang w:val="fr-FR"/>
+        </w:rPr>
+        <w:drawing>
+          <wp:inline distT="0" distB="0" distL="0" distR="0" wp14:anchorId="4AC45C10" wp14:editId="17A9F908">
+            <wp:extent cx="5731510" cy="2640965"/>
+            <wp:effectExtent l="0" t="0" r="2540" b="6985"/>
+            <wp:docPr id="183599060" name="Picture 1"/>
+            <wp:cNvGraphicFramePr>
+              <a:graphicFrameLocks xmlns:a="http://schemas.openxmlformats.org/drawingml/2006/main" noChangeAspect="1"/>
+            </wp:cNvGraphicFramePr>
+            <a:graphic xmlns:a="http://schemas.openxmlformats.org/drawingml/2006/main">
+              <a:graphicData uri="http://schemas.openxmlformats.org/drawingml/2006/picture">
+                <pic:pic xmlns:pic="http://schemas.openxmlformats.org/drawingml/2006/picture">
+                  <pic:nvPicPr>
+                    <pic:cNvPr id="183599060" name=""/>
+                    <pic:cNvPicPr/>
+                  </pic:nvPicPr>
+                  <pic:blipFill>
+                    <a:blip r:embed="rId9"/>
+                    <a:stretch>
+                      <a:fillRect/>
+                    </a:stretch>
+                  </pic:blipFill>
+                  <pic:spPr>
+                    <a:xfrm>
+                      <a:off x="0" y="0"/>
+                      <a:ext cx="5731510" cy="2640965"/>
+                    </a:xfrm>
+                    <a:prstGeom prst="rect">
+                      <a:avLst/>
+                    </a:prstGeom>
+                  </pic:spPr>
+                </pic:pic>
+              </a:graphicData>
+            </a:graphic>
+          </wp:inline>
+        </w:drawing>
+      </w:r>
+    </w:p>
+    <w:p>
+      <w:pPr>
+        <w:rPr>
+          <w:lang w:val="fr-FR"/>
+        </w:rPr>
+      </w:pPr>
+    </w:p>
+    <w:p>
+      <w:pPr>
+        <w:rPr>
+          <w:lang w:val="fr-FR"/>
+        </w:rPr>
+      </w:pPr>
+    </w:p>
+    <w:p>
+      <w:pPr>
+        <w:rPr>
+          <w:lang w:val="fr-FR"/>
+        </w:rPr>
+      </w:pPr>
+    </w:p>
+    <w:p>
+      <w:pPr>
+        <w:rPr>
+          <w:lang w:val="fr-FR"/>
+        </w:rPr>
+      </w:pPr>
+      <w:proofErr w:type="spellStart"/>
+      <w:r>
+        <w:rPr>
+          <w:lang w:val="fr-FR"/>
+        </w:rPr>
+        <w:t>Acml</w:t>
+      </w:r>
+      <w:proofErr w:type="spellEnd"/>
+      <w:r>
+        <w:rPr>
+          <w:lang w:val="fr-FR"/>
+        </w:rPr>
+        <w:t xml:space="preserve"> positions</w:t>
+      </w:r>
+    </w:p>
+    <w:p>
+      <w:pPr>
+        <w:rPr>
+          <w:lang w:val="fr-FR"/>
+        </w:rPr>
+      </w:pPr>
+      <w:proofErr w:type="gramStart"/>
+      <w:r>
+        <w:rPr>
+          <w:lang w:val="fr-FR"/>
+        </w:rPr>
+        <w:t>pose:</w:t>
+      </w:r>
+      <w:proofErr w:type="gramEnd"/>
+    </w:p>
+    <w:p>
+      <w:pPr>
+        <w:rPr>
+          <w:lang w:val="fr-FR"/>
+        </w:rPr>
+      </w:pPr>
+      <w:r>
+        <w:rPr>
+          <w:lang w:val="fr-FR"/>
+        </w:rPr>
+        <w:lastRenderedPageBreak/>
+        <w:t xml:space="preserve">    </w:t>
+      </w:r>
+      <w:proofErr w:type="gramStart"/>
+      <w:r>
+        <w:rPr>
+          <w:lang w:val="fr-FR"/>
+        </w:rPr>
+        <w:t>position:</w:t>
+      </w:r>
+      <w:proofErr w:type="gramEnd"/>
+    </w:p>
+    <w:p>
+      <w:pPr>
+        <w:rPr>
+          <w:lang w:val="fr-FR"/>
+        </w:rPr>
+      </w:pPr>
+      <w:r>
+        <w:rPr>
+          <w:lang w:val="fr-FR"/>
+        </w:rPr>
+        <w:t xml:space="preserve">      </w:t>
+      </w:r>
+      <w:proofErr w:type="gramStart"/>
+      <w:r>
+        <w:rPr>
+          <w:lang w:val="fr-FR"/>
+        </w:rPr>
+        <w:t>x:</w:t>
+      </w:r>
+      <w:proofErr w:type="gramEnd"/>
+      <w:r>
+        <w:rPr>
+          <w:lang w:val="fr-FR"/>
+        </w:rPr>
+        <w:t xml:space="preserve"> 0.18221901236879298</w:t>
+      </w:r>
+    </w:p>
+    <w:p>
+      <w:pPr>
+        <w:rPr>
+          <w:lang w:val="fr-FR"/>
+        </w:rPr>
+      </w:pPr>
+      <w:r>
+        <w:rPr>
+          <w:lang w:val="fr-FR"/>
+        </w:rPr>
+        <w:t xml:space="preserve">      </w:t>
+      </w:r>
+      <w:proofErr w:type="gramStart"/>
+      <w:r>
+        <w:rPr>
+          <w:lang w:val="fr-FR"/>
+        </w:rPr>
+        <w:t>y:</w:t>
+      </w:r>
+      <w:proofErr w:type="gramEnd"/>
+      <w:r>
+        <w:rPr>
+          <w:lang w:val="fr-FR"/>
+        </w:rPr>
+        <w:t xml:space="preserve"> -2.6835781726193084</w:t>
+      </w:r>
+    </w:p>
+    <w:p>
+      <w:pPr>
+        <w:rPr>
+          <w:lang w:val="fr-FR"/>
+        </w:rPr>
+      </w:pPr>
+      <w:r>
+        <w:rPr>
+          <w:lang w:val="fr-FR"/>
+        </w:rPr>
+        <w:t xml:space="preserve">      </w:t>
+      </w:r>
+      <w:proofErr w:type="gramStart"/>
+      <w:r>
+        <w:rPr>
+          <w:lang w:val="fr-FR"/>
+        </w:rPr>
+        <w:t>z:</w:t>
+      </w:r>
+      <w:proofErr w:type="gramEnd"/>
+      <w:r>
+        <w:rPr>
+          <w:lang w:val="fr-FR"/>
+        </w:rPr>
+        <w:t xml:space="preserve"> 0.0</w:t>
+      </w:r>
+    </w:p>
+    <w:p>
+      <w:pPr>
+        <w:rPr>
+          <w:lang w:val="fr-FR"/>
+        </w:rPr>
+      </w:pPr>
+    </w:p>
+    <w:p>
+      <w:r>
+        <w:drawing>
+          <wp:inline distT="0" distB="0" distL="0" distR="0" wp14:anchorId="087E2C26" wp14:editId="5B1838C9">
+            <wp:extent cx="5731510" cy="3117215"/>
+            <wp:effectExtent l="0" t="0" r="2540" b="6985"/>
+            <wp:docPr id="1548854256" name="Picture 1"/>
+            <wp:cNvGraphicFramePr>
+              <a:graphicFrameLocks xmlns:a="http://schemas.openxmlformats.org/drawingml/2006/main" noChangeAspect="1"/>
+            </wp:cNvGraphicFramePr>
+            <a:graphic xmlns:a="http://schemas.openxmlformats.org/drawingml/2006/main">
+              <a:graphicData uri="http://schemas.openxmlformats.org/drawingml/2006/picture">
+                <pic:pic xmlns:pic="http://schemas.openxmlformats.org/drawingml/2006/picture">
+                  <pic:nvPicPr>
+                    <pic:cNvPr id="1548854256" name=""/>
+                    <pic:cNvPicPr/>
+                  </pic:nvPicPr>
+                  <pic:blipFill>
+                    <a:blip r:embed="rId10"/>
+                    <a:stretch>
+                      <a:fillRect/>
+                    </a:stretch>
+                  </pic:blipFill>
+                  <pic:spPr>
+                    <a:xfrm>
+                      <a:off x="0" y="0"/>
+                      <a:ext cx="5731510" cy="3117215"/>
+                    </a:xfrm>
+                    <a:prstGeom prst="rect">
+                      <a:avLst/>
+                    </a:prstGeom>
+                  </pic:spPr>
+                </pic:pic>
+              </a:graphicData>
+            </a:graphic>
+          </wp:inline>
+        </w:drawing>
+      </w:r>
+    </w:p>
     <w:p/>
+    <w:p/>
+    <w:p/>
     <w:p>
       <w:pPr>
         <w:rPr>
@@ -127,6 +1496,10 @@
     </w:p>
     <w:p>
       <w:r>
+        <w:rPr>
+          <w:noProof/>
+        </w:rPr>
+        <w:lastRenderedPageBreak/>
         <w:drawing>
           <wp:inline distT="0" distB="0" distL="0" distR="0" wp14:anchorId="329A9691" wp14:editId="16EF7E48">
             <wp:extent cx="5731510" cy="3477895"/>
@@ -143,7 +1516,7 @@
                     <pic:cNvPicPr/>
                   </pic:nvPicPr>
                   <pic:blipFill>
-                    <a:blip r:embed="rId4"/>
+                    <a:blip r:embed="rId11"/>
                     <a:stretch>
                       <a:fillRect/>
                     </a:stretch>
@@ -188,7 +1561,9 @@
     </w:p>
     <w:p>
       <w:r>
-        <w:lastRenderedPageBreak/>
+        <w:rPr>
+          <w:noProof/>
+        </w:rPr>
         <w:drawing>
           <wp:inline distT="0" distB="0" distL="0" distR="0" wp14:anchorId="7DE80C92" wp14:editId="5DFC301C">
             <wp:extent cx="5731510" cy="2491740"/>
@@ -205,7 +1580,7 @@
                     <pic:cNvPicPr/>
                   </pic:nvPicPr>
                   <pic:blipFill>
-                    <a:blip r:embed="rId5"/>
+                    <a:blip r:embed="rId12"/>
                     <a:stretch>
                       <a:fillRect/>
                     </a:stretch>
@@ -234,6 +1609,7 @@
     </w:p>
     <w:p>
       <w:r>
+        <w:lastRenderedPageBreak/>
         <w:t xml:space="preserve">    position:</w:t>
       </w:r>
     </w:p>
@@ -258,8 +1634,8 @@
         <w:rPr>
           <w:b/>
           <w:bCs/>
-        </w:rPr>
-        <w:lastRenderedPageBreak/>
+          <w:noProof/>
+        </w:rPr>
         <w:drawing>
           <wp:inline distT="0" distB="0" distL="0" distR="0" wp14:anchorId="0F038533" wp14:editId="36C32A26">
             <wp:extent cx="5731510" cy="5229860"/>
@@ -276,7 +1652,7 @@
                     <pic:cNvPicPr/>
                   </pic:nvPicPr>
                   <pic:blipFill>
-                    <a:blip r:embed="rId6"/>
+                    <a:blip r:embed="rId13"/>
                     <a:stretch>
                       <a:fillRect/>
                     </a:stretch>
@@ -371,6 +1747,7 @@
     </w:p>
     <w:p>
       <w:r>
+        <w:lastRenderedPageBreak/>
         <w:t>ros2 launch turtlebot3_gazebo turtlebot3_house.launch.py</w:t>
       </w:r>
     </w:p>
@@ -381,7 +1758,6 @@
     </w:p>
     <w:p>
       <w:r>
-        <w:lastRenderedPageBreak/>
         <w:pict w14:anchorId="2F7A2065">
           <v:rect id="_x0000_i1025" style="width:0;height:1.5pt" o:hralign="center" o:hrstd="t" o:hr="t" fillcolor="#a0a0a0" stroked="f"/>
         </w:pict>
@@ -621,6 +1997,7 @@
     </w:p>
     <w:p>
       <w:r>
+        <w:lastRenderedPageBreak/>
         <w:t xml:space="preserve">  </w:t>
       </w:r>
       <w:proofErr w:type="gramStart"/>
@@ -655,7 +2032,6 @@
     </w:p>
     <w:p>
       <w:r>
-        <w:lastRenderedPageBreak/>
         <w:t>RViz should open showing the map. Set the 2D Pose Estimate in RViz to align the robot with the map.</w:t>
       </w:r>
     </w:p>

</xml_diff>

<commit_message>
update fixed starting point program - works totally fine
</commit_message>
<xml_diff>
--- a/src/smart_energy_management_robot/Images/development stages.docx
+++ b/src/smart_energy_management_robot/Images/development stages.docx
@@ -17,7 +17,15 @@
     </w:p>
     <w:p>
       <w:r>
-        <w:t>  living_room:  [-2.84,  3.08]</w:t>
+        <w:t xml:space="preserve">  </w:t>
+      </w:r>
+      <w:proofErr w:type="spellStart"/>
+      <w:r>
+        <w:t>living_room</w:t>
+      </w:r>
+      <w:proofErr w:type="spellEnd"/>
+      <w:r>
+        <w:t>:  [-2.84,  3.08]</w:t>
       </w:r>
     </w:p>
     <w:p>
@@ -54,6 +62,7 @@
           <w:lang w:val="fr-FR"/>
         </w:rPr>
       </w:pPr>
+      <w:proofErr w:type="spellStart"/>
       <w:r>
         <w:rPr>
           <w:b/>
@@ -70,6 +79,7 @@
         </w:rPr>
         <w:t>athroom</w:t>
       </w:r>
+      <w:proofErr w:type="spellEnd"/>
     </w:p>
     <w:p>
       <w:pPr>
@@ -591,6 +601,7 @@
           <w:lang w:val="fr-FR"/>
         </w:rPr>
       </w:pPr>
+      <w:proofErr w:type="spellStart"/>
       <w:r>
         <w:rPr>
           <w:b/>
@@ -599,6 +610,7 @@
         </w:rPr>
         <w:t>Balcony</w:t>
       </w:r>
+      <w:proofErr w:type="spellEnd"/>
     </w:p>
     <w:p>
       <w:pPr>
@@ -849,11 +861,135 @@
           <w:lang w:val="fr-FR"/>
         </w:rPr>
       </w:pPr>
-      <w:r>
-        <w:rPr>
-          <w:lang w:val="fr-FR"/>
-        </w:rPr>
-        <w:t>Acml positions</w:t>
+      <w:proofErr w:type="spellStart"/>
+      <w:r>
+        <w:rPr>
+          <w:lang w:val="fr-FR"/>
+        </w:rPr>
+        <w:t>Acml</w:t>
+      </w:r>
+      <w:proofErr w:type="spellEnd"/>
+      <w:r>
+        <w:rPr>
+          <w:lang w:val="fr-FR"/>
+        </w:rPr>
+        <w:t xml:space="preserve"> positions</w:t>
+      </w:r>
+    </w:p>
+    <w:p>
+      <w:pPr>
+        <w:rPr>
+          <w:b/>
+          <w:bCs/>
+          <w:lang w:val="fr-FR"/>
+        </w:rPr>
+      </w:pPr>
+      <w:r>
+        <w:rPr>
+          <w:b/>
+          <w:bCs/>
+          <w:lang w:val="fr-FR"/>
+        </w:rPr>
+        <w:t>Initial pose</w:t>
+      </w:r>
+    </w:p>
+    <w:p>
+      <w:pPr>
+        <w:rPr>
+          <w:lang w:val="fr-FR"/>
+        </w:rPr>
+      </w:pPr>
+      <w:r>
+        <w:rPr>
+          <w:lang w:val="fr-FR"/>
+        </w:rPr>
+        <w:drawing>
+          <wp:inline distT="0" distB="0" distL="0" distR="0" wp14:anchorId="30779399" wp14:editId="2933B1BF">
+            <wp:extent cx="5731510" cy="3216910"/>
+            <wp:effectExtent l="0" t="0" r="2540" b="2540"/>
+            <wp:docPr id="1057157384" name="Picture 1"/>
+            <wp:cNvGraphicFramePr>
+              <a:graphicFrameLocks xmlns:a="http://schemas.openxmlformats.org/drawingml/2006/main" noChangeAspect="1"/>
+            </wp:cNvGraphicFramePr>
+            <a:graphic xmlns:a="http://schemas.openxmlformats.org/drawingml/2006/main">
+              <a:graphicData uri="http://schemas.openxmlformats.org/drawingml/2006/picture">
+                <pic:pic xmlns:pic="http://schemas.openxmlformats.org/drawingml/2006/picture">
+                  <pic:nvPicPr>
+                    <pic:cNvPr id="1057157384" name=""/>
+                    <pic:cNvPicPr/>
+                  </pic:nvPicPr>
+                  <pic:blipFill>
+                    <a:blip r:embed="rId10"/>
+                    <a:stretch>
+                      <a:fillRect/>
+                    </a:stretch>
+                  </pic:blipFill>
+                  <pic:spPr>
+                    <a:xfrm>
+                      <a:off x="0" y="0"/>
+                      <a:ext cx="5731510" cy="3216910"/>
+                    </a:xfrm>
+                    <a:prstGeom prst="rect">
+                      <a:avLst/>
+                    </a:prstGeom>
+                  </pic:spPr>
+                </pic:pic>
+              </a:graphicData>
+            </a:graphic>
+          </wp:inline>
+        </w:drawing>
+      </w:r>
+    </w:p>
+    <w:p>
+      <w:pPr>
+        <w:rPr>
+          <w:lang w:val="fr-FR"/>
+        </w:rPr>
+      </w:pPr>
+      <w:r>
+        <w:rPr>
+          <w:lang w:val="fr-FR"/>
+        </w:rPr>
+        <w:t>pose:</w:t>
+      </w:r>
+    </w:p>
+    <w:p>
+      <w:pPr>
+        <w:rPr>
+          <w:lang w:val="fr-FR"/>
+        </w:rPr>
+      </w:pPr>
+      <w:r>
+        <w:rPr>
+          <w:lang w:val="fr-FR"/>
+        </w:rPr>
+        <w:t xml:space="preserve">    position:</w:t>
+      </w:r>
+    </w:p>
+    <w:p>
+      <w:pPr>
+        <w:rPr>
+          <w:lang w:val="fr-FR"/>
+        </w:rPr>
+      </w:pPr>
+      <w:r>
+        <w:rPr>
+          <w:lang w:val="fr-FR"/>
+        </w:rPr>
+        <w:t xml:space="preserve">      x: -2.012779820121675</w:t>
+      </w:r>
+    </w:p>
+    <w:p>
+      <w:pPr>
+        <w:rPr>
+          <w:lang w:val="fr-FR"/>
+        </w:rPr>
+      </w:pPr>
+      <w:r>
+        <w:rPr>
+          <w:lang w:val="fr-FR"/>
+        </w:rPr>
+        <w:t xml:space="preserve">      y: -0.38677948581587956</w:t>
       </w:r>
     </w:p>
     <w:p>
@@ -881,8 +1017,10 @@
       </w:pPr>
       <w:r>
         <w:rPr>
-          <w:lang w:val="fr-FR"/>
-        </w:rPr>
+          <w:noProof/>
+          <w:lang w:val="fr-FR"/>
+        </w:rPr>
+        <w:lastRenderedPageBreak/>
         <w:drawing>
           <wp:inline distT="0" distB="0" distL="0" distR="0" wp14:anchorId="77B03471" wp14:editId="62FDB2E2">
             <wp:extent cx="5731510" cy="3383280"/>
@@ -899,7 +1037,7 @@
                     <pic:cNvPicPr/>
                   </pic:nvPicPr>
                   <pic:blipFill>
-                    <a:blip r:embed="rId10"/>
+                    <a:blip r:embed="rId11"/>
                     <a:stretch>
                       <a:fillRect/>
                     </a:stretch>
@@ -990,54 +1128,28 @@
         <w:rPr>
           <w:b/>
           <w:bCs/>
-          <w:lang w:val="fr-FR"/>
-        </w:rPr>
-      </w:pPr>
-      <w:r>
-        <w:rPr>
-          <w:b/>
-          <w:bCs/>
-          <w:lang w:val="fr-FR"/>
+        </w:rPr>
+      </w:pPr>
+      <w:r>
+        <w:rPr>
+          <w:b/>
+          <w:bCs/>
         </w:rPr>
         <w:t>Living Room</w:t>
       </w:r>
     </w:p>
     <w:p>
-      <w:pPr>
-        <w:rPr>
-          <w:lang w:val="fr-FR"/>
-        </w:rPr>
-      </w:pPr>
-      <w:r>
-        <w:rPr>
-          <w:lang w:val="fr-FR"/>
-        </w:rPr>
+      <w:r>
         <w:t>pose:</w:t>
       </w:r>
     </w:p>
     <w:p>
-      <w:pPr>
-        <w:rPr>
-          <w:lang w:val="fr-FR"/>
-        </w:rPr>
-      </w:pPr>
-      <w:r>
-        <w:rPr>
-          <w:lang w:val="fr-FR"/>
-        </w:rPr>
+      <w:r>
         <w:t xml:space="preserve">    position:</w:t>
       </w:r>
     </w:p>
     <w:p>
-      <w:pPr>
-        <w:rPr>
-          <w:lang w:val="fr-FR"/>
-        </w:rPr>
-      </w:pPr>
-      <w:r>
-        <w:rPr>
-          <w:lang w:val="fr-FR"/>
-        </w:rPr>
+      <w:r>
         <w:t xml:space="preserve">      x: -2.654907423363032</w:t>
       </w:r>
     </w:p>
@@ -1048,10 +1160,13 @@
         </w:rPr>
       </w:pPr>
       <w:r>
-        <w:rPr>
-          <w:lang w:val="fr-FR"/>
-        </w:rPr>
-        <w:t xml:space="preserve">      y: 3.1601438338950163</w:t>
+        <w:t xml:space="preserve">      </w:t>
+      </w:r>
+      <w:r>
+        <w:rPr>
+          <w:lang w:val="fr-FR"/>
+        </w:rPr>
+        <w:t>y: 3.1601438338950163</w:t>
       </w:r>
     </w:p>
     <w:p>
@@ -1084,6 +1199,77 @@
           <w:lang w:val="fr-FR"/>
         </w:rPr>
       </w:pPr>
+      <w:proofErr w:type="spellStart"/>
+      <w:r>
+        <w:rPr>
+          <w:b/>
+          <w:bCs/>
+          <w:lang w:val="fr-FR"/>
+        </w:rPr>
+        <w:t>Balcony</w:t>
+      </w:r>
+      <w:proofErr w:type="spellEnd"/>
+    </w:p>
+    <w:p>
+      <w:pPr>
+        <w:rPr>
+          <w:lang w:val="fr-FR"/>
+        </w:rPr>
+      </w:pPr>
+      <w:r>
+        <w:rPr>
+          <w:lang w:val="fr-FR"/>
+        </w:rPr>
+        <w:t>position:</w:t>
+      </w:r>
+    </w:p>
+    <w:p>
+      <w:pPr>
+        <w:rPr>
+          <w:lang w:val="fr-FR"/>
+        </w:rPr>
+      </w:pPr>
+      <w:r>
+        <w:rPr>
+          <w:lang w:val="fr-FR"/>
+        </w:rPr>
+        <w:t xml:space="preserve">      x: -6.238135476545508</w:t>
+      </w:r>
+    </w:p>
+    <w:p>
+      <w:pPr>
+        <w:rPr>
+          <w:lang w:val="fr-FR"/>
+        </w:rPr>
+      </w:pPr>
+      <w:r>
+        <w:rPr>
+          <w:lang w:val="fr-FR"/>
+        </w:rPr>
+        <w:t xml:space="preserve">      y: 3.256342766515622</w:t>
+      </w:r>
+    </w:p>
+    <w:p>
+      <w:pPr>
+        <w:rPr>
+          <w:lang w:val="fr-FR"/>
+        </w:rPr>
+      </w:pPr>
+      <w:r>
+        <w:rPr>
+          <w:lang w:val="fr-FR"/>
+        </w:rPr>
+        <w:t xml:space="preserve">      z: 0.0</w:t>
+      </w:r>
+    </w:p>
+    <w:p>
+      <w:pPr>
+        <w:rPr>
+          <w:b/>
+          <w:bCs/>
+          <w:lang w:val="fr-FR"/>
+        </w:rPr>
+      </w:pPr>
       <w:r>
         <w:rPr>
           <w:b/>
@@ -1091,46 +1277,116 @@
           <w:lang w:val="fr-FR"/>
         </w:rPr>
         <w:lastRenderedPageBreak/>
-        <w:t>Balcony</w:t>
-      </w:r>
-    </w:p>
-    <w:p>
-      <w:pPr>
-        <w:rPr>
-          <w:lang w:val="fr-FR"/>
-        </w:rPr>
-      </w:pPr>
-      <w:r>
-        <w:rPr>
-          <w:lang w:val="fr-FR"/>
-        </w:rPr>
-        <w:t>position:</w:t>
-      </w:r>
-    </w:p>
-    <w:p>
-      <w:pPr>
-        <w:rPr>
-          <w:lang w:val="fr-FR"/>
-        </w:rPr>
-      </w:pPr>
-      <w:r>
-        <w:rPr>
-          <w:lang w:val="fr-FR"/>
-        </w:rPr>
-        <w:t xml:space="preserve">      x: -6.238135476545508</w:t>
-      </w:r>
-    </w:p>
-    <w:p>
-      <w:pPr>
-        <w:rPr>
-          <w:lang w:val="fr-FR"/>
-        </w:rPr>
-      </w:pPr>
-      <w:r>
-        <w:rPr>
-          <w:lang w:val="fr-FR"/>
-        </w:rPr>
-        <w:t xml:space="preserve">      y: 3.256342766515622</w:t>
+        <w:t>Kitchen</w:t>
+      </w:r>
+    </w:p>
+    <w:p>
+      <w:pPr>
+        <w:rPr>
+          <w:lang w:val="fr-FR"/>
+        </w:rPr>
+      </w:pPr>
+      <w:r>
+        <w:rPr>
+          <w:lang w:val="fr-FR"/>
+        </w:rPr>
+        <w:t>pose:</w:t>
+      </w:r>
+    </w:p>
+    <w:p>
+      <w:pPr>
+        <w:rPr>
+          <w:lang w:val="fr-FR"/>
+        </w:rPr>
+      </w:pPr>
+      <w:r>
+        <w:rPr>
+          <w:lang w:val="fr-FR"/>
+        </w:rPr>
+        <w:t xml:space="preserve">    position:</w:t>
+      </w:r>
+    </w:p>
+    <w:p>
+      <w:pPr>
+        <w:rPr>
+          <w:lang w:val="fr-FR"/>
+        </w:rPr>
+      </w:pPr>
+      <w:r>
+        <w:rPr>
+          <w:lang w:val="fr-FR"/>
+        </w:rPr>
+        <w:t xml:space="preserve">      x: -6.3914815685977375</w:t>
+      </w:r>
+    </w:p>
+    <w:p>
+      <w:pPr>
+        <w:rPr>
+          <w:lang w:val="fr-FR"/>
+        </w:rPr>
+      </w:pPr>
+      <w:r>
+        <w:rPr>
+          <w:lang w:val="fr-FR"/>
+        </w:rPr>
+        <w:t xml:space="preserve">      y: -1.3059959384038216</w:t>
+      </w:r>
+    </w:p>
+    <w:p>
+      <w:r>
+        <w:rPr>
+          <w:lang w:val="fr-FR"/>
+        </w:rPr>
+        <w:t xml:space="preserve">      </w:t>
+      </w:r>
+      <w:r>
+        <w:t>z: 0.0</w:t>
+      </w:r>
+    </w:p>
+    <w:p>
+      <w:pPr>
+        <w:rPr>
+          <w:b/>
+          <w:bCs/>
+        </w:rPr>
+      </w:pPr>
+      <w:r>
+        <w:rPr>
+          <w:b/>
+          <w:bCs/>
+        </w:rPr>
+        <w:t>Bedroom</w:t>
+      </w:r>
+    </w:p>
+    <w:p>
+      <w:r>
+        <w:t>pose:</w:t>
+      </w:r>
+    </w:p>
+    <w:p>
+      <w:r>
+        <w:t xml:space="preserve">    position:</w:t>
+      </w:r>
+    </w:p>
+    <w:p>
+      <w:r>
+        <w:t xml:space="preserve">      x: 4.687125954011552</w:t>
+      </w:r>
+    </w:p>
+    <w:p>
+      <w:pPr>
+        <w:rPr>
+          <w:lang w:val="fr-FR"/>
+        </w:rPr>
+      </w:pPr>
+      <w:r>
+        <w:t xml:space="preserve">      </w:t>
+      </w:r>
+      <w:r>
+        <w:rPr>
+          <w:lang w:val="fr-FR"/>
+        </w:rPr>
+        <w:t>y: 2.704795383006298</w:t>
       </w:r>
     </w:p>
     <w:p>
@@ -1154,14 +1410,16 @@
           <w:lang w:val="fr-FR"/>
         </w:rPr>
       </w:pPr>
-      <w:r>
-        <w:rPr>
-          <w:b/>
-          <w:bCs/>
-          <w:lang w:val="fr-FR"/>
-        </w:rPr>
-        <w:t>Kitchen</w:t>
-      </w:r>
+      <w:proofErr w:type="spellStart"/>
+      <w:r>
+        <w:rPr>
+          <w:b/>
+          <w:bCs/>
+          <w:lang w:val="fr-FR"/>
+        </w:rPr>
+        <w:t>Bathroom</w:t>
+      </w:r>
+      <w:proofErr w:type="spellEnd"/>
     </w:p>
     <w:p>
       <w:pPr>
@@ -1199,20 +1457,20 @@
         <w:rPr>
           <w:lang w:val="fr-FR"/>
         </w:rPr>
-        <w:t xml:space="preserve">      x: -6.3914815685977375</w:t>
-      </w:r>
-    </w:p>
-    <w:p>
-      <w:pPr>
-        <w:rPr>
-          <w:lang w:val="fr-FR"/>
-        </w:rPr>
-      </w:pPr>
-      <w:r>
-        <w:rPr>
-          <w:lang w:val="fr-FR"/>
-        </w:rPr>
-        <w:t xml:space="preserve">      y: -1.3059959384038216</w:t>
+        <w:t xml:space="preserve">      x: 5.318515123819653</w:t>
+      </w:r>
+    </w:p>
+    <w:p>
+      <w:pPr>
+        <w:rPr>
+          <w:lang w:val="fr-FR"/>
+        </w:rPr>
+      </w:pPr>
+      <w:r>
+        <w:rPr>
+          <w:lang w:val="fr-FR"/>
+        </w:rPr>
+        <w:t xml:space="preserve">      y: -2.6610461354165373</w:t>
       </w:r>
     </w:p>
     <w:p>
@@ -1231,19 +1489,29 @@
     <w:p>
       <w:pPr>
         <w:rPr>
-          <w:b/>
-          <w:bCs/>
-          <w:lang w:val="fr-FR"/>
-        </w:rPr>
-      </w:pPr>
-      <w:r>
-        <w:rPr>
-          <w:b/>
-          <w:bCs/>
-          <w:lang w:val="fr-FR"/>
-        </w:rPr>
-        <w:t>Bedroom</w:t>
-      </w:r>
+          <w:lang w:val="fr-FR"/>
+        </w:rPr>
+      </w:pPr>
+      <w:r>
+        <w:rPr>
+          <w:lang w:val="fr-FR"/>
+        </w:rPr>
+        <w:t>---------------------------- END ---------------------------</w:t>
+      </w:r>
+    </w:p>
+    <w:p>
+      <w:pPr>
+        <w:rPr>
+          <w:lang w:val="fr-FR"/>
+        </w:rPr>
+      </w:pPr>
+    </w:p>
+    <w:p>
+      <w:pPr>
+        <w:rPr>
+          <w:lang w:val="fr-FR"/>
+        </w:rPr>
+      </w:pPr>
     </w:p>
     <w:p>
       <w:pPr>
@@ -1281,20 +1549,20 @@
         <w:rPr>
           <w:lang w:val="fr-FR"/>
         </w:rPr>
-        <w:t xml:space="preserve">      x: 4.687125954011552</w:t>
-      </w:r>
-    </w:p>
-    <w:p>
-      <w:pPr>
-        <w:rPr>
-          <w:lang w:val="fr-FR"/>
-        </w:rPr>
-      </w:pPr>
-      <w:r>
-        <w:rPr>
-          <w:lang w:val="fr-FR"/>
-        </w:rPr>
-        <w:t xml:space="preserve">      y: 2.704795383006298</w:t>
+        <w:t xml:space="preserve">      x: 0.18221901236879298</w:t>
+      </w:r>
+    </w:p>
+    <w:p>
+      <w:pPr>
+        <w:rPr>
+          <w:lang w:val="fr-FR"/>
+        </w:rPr>
+      </w:pPr>
+      <w:r>
+        <w:rPr>
+          <w:lang w:val="fr-FR"/>
+        </w:rPr>
+        <w:t xml:space="preserve">      y: -2.6835781726193084</w:t>
       </w:r>
     </w:p>
     <w:p>
@@ -1313,190 +1581,16 @@
     <w:p>
       <w:pPr>
         <w:rPr>
-          <w:b/>
-          <w:bCs/>
-          <w:lang w:val="fr-FR"/>
-        </w:rPr>
-      </w:pPr>
-      <w:r>
-        <w:rPr>
-          <w:b/>
-          <w:bCs/>
-          <w:lang w:val="fr-FR"/>
-        </w:rPr>
-        <w:t>Bathroom</w:t>
-      </w:r>
-    </w:p>
-    <w:p>
-      <w:pPr>
-        <w:rPr>
-          <w:lang w:val="fr-FR"/>
-        </w:rPr>
-      </w:pPr>
-      <w:r>
-        <w:rPr>
-          <w:lang w:val="fr-FR"/>
-        </w:rPr>
-        <w:t>pose:</w:t>
-      </w:r>
-    </w:p>
-    <w:p>
-      <w:pPr>
-        <w:rPr>
-          <w:lang w:val="fr-FR"/>
-        </w:rPr>
-      </w:pPr>
-      <w:r>
-        <w:rPr>
-          <w:lang w:val="fr-FR"/>
-        </w:rPr>
-        <w:t xml:space="preserve">    position:</w:t>
-      </w:r>
-    </w:p>
-    <w:p>
-      <w:pPr>
-        <w:rPr>
-          <w:lang w:val="fr-FR"/>
-        </w:rPr>
-      </w:pPr>
-      <w:r>
-        <w:rPr>
-          <w:lang w:val="fr-FR"/>
-        </w:rPr>
-        <w:t xml:space="preserve">      x: 5.318515123819653</w:t>
-      </w:r>
-    </w:p>
-    <w:p>
-      <w:pPr>
-        <w:rPr>
-          <w:lang w:val="fr-FR"/>
-        </w:rPr>
-      </w:pPr>
-      <w:r>
-        <w:rPr>
-          <w:lang w:val="fr-FR"/>
-        </w:rPr>
-        <w:t xml:space="preserve">      y: -2.6610461354165373</w:t>
-      </w:r>
-    </w:p>
-    <w:p>
-      <w:pPr>
-        <w:rPr>
-          <w:lang w:val="fr-FR"/>
-        </w:rPr>
-      </w:pPr>
-      <w:r>
-        <w:rPr>
-          <w:lang w:val="fr-FR"/>
-        </w:rPr>
-        <w:t xml:space="preserve">      z: 0.0</w:t>
-      </w:r>
-    </w:p>
-    <w:p>
-      <w:pPr>
-        <w:rPr>
-          <w:lang w:val="fr-FR"/>
-        </w:rPr>
-      </w:pPr>
-      <w:r>
-        <w:rPr>
-          <w:lang w:val="fr-FR"/>
-        </w:rPr>
-        <w:t>---------------------------- END ---------------------------</w:t>
-      </w:r>
-    </w:p>
-    <w:p>
-      <w:pPr>
-        <w:rPr>
-          <w:lang w:val="fr-FR"/>
-        </w:rPr>
-      </w:pPr>
-    </w:p>
-    <w:p>
-      <w:pPr>
-        <w:rPr>
-          <w:lang w:val="fr-FR"/>
-        </w:rPr>
-      </w:pPr>
-    </w:p>
-    <w:p>
-      <w:pPr>
-        <w:rPr>
-          <w:lang w:val="fr-FR"/>
-        </w:rPr>
-      </w:pPr>
-      <w:r>
-        <w:rPr>
-          <w:lang w:val="fr-FR"/>
-        </w:rPr>
-        <w:t>pose:</w:t>
-      </w:r>
-    </w:p>
-    <w:p>
-      <w:pPr>
-        <w:rPr>
-          <w:lang w:val="fr-FR"/>
-        </w:rPr>
-      </w:pPr>
-      <w:r>
-        <w:rPr>
-          <w:lang w:val="fr-FR"/>
-        </w:rPr>
-        <w:t xml:space="preserve">    position:</w:t>
-      </w:r>
-    </w:p>
-    <w:p>
-      <w:pPr>
-        <w:rPr>
-          <w:lang w:val="fr-FR"/>
-        </w:rPr>
-      </w:pPr>
-      <w:r>
-        <w:rPr>
-          <w:lang w:val="fr-FR"/>
+          <w:lang w:val="fr-FR"/>
+        </w:rPr>
+      </w:pPr>
+    </w:p>
+    <w:p>
+      <w:r>
+        <w:rPr>
+          <w:noProof/>
         </w:rPr>
         <w:lastRenderedPageBreak/>
-        <w:t xml:space="preserve">      x: 0.18221901236879298</w:t>
-      </w:r>
-    </w:p>
-    <w:p>
-      <w:pPr>
-        <w:rPr>
-          <w:lang w:val="fr-FR"/>
-        </w:rPr>
-      </w:pPr>
-      <w:r>
-        <w:rPr>
-          <w:lang w:val="fr-FR"/>
-        </w:rPr>
-        <w:t xml:space="preserve">      y: -2.6835781726193084</w:t>
-      </w:r>
-    </w:p>
-    <w:p>
-      <w:pPr>
-        <w:rPr>
-          <w:lang w:val="fr-FR"/>
-        </w:rPr>
-      </w:pPr>
-      <w:r>
-        <w:rPr>
-          <w:lang w:val="fr-FR"/>
-        </w:rPr>
-        <w:t xml:space="preserve">      z: 0.0</w:t>
-      </w:r>
-    </w:p>
-    <w:p>
-      <w:pPr>
-        <w:rPr>
-          <w:lang w:val="fr-FR"/>
-        </w:rPr>
-      </w:pPr>
-    </w:p>
-    <w:p>
-      <w:r>
-        <w:rPr>
-          <w:noProof/>
-        </w:rPr>
         <w:drawing>
           <wp:inline distT="0" distB="0" distL="0" distR="0" wp14:anchorId="087E2C26" wp14:editId="5B1838C9">
             <wp:extent cx="5731510" cy="3117215"/>
@@ -1513,7 +1607,7 @@
                     <pic:cNvPicPr/>
                   </pic:nvPicPr>
                   <pic:blipFill>
-                    <a:blip r:embed="rId11"/>
+                    <a:blip r:embed="rId12"/>
                     <a:stretch>
                       <a:fillRect/>
                     </a:stretch>
@@ -1635,7 +1729,7 @@
                     <pic:cNvPicPr/>
                   </pic:nvPicPr>
                   <pic:blipFill>
-                    <a:blip r:embed="rId12"/>
+                    <a:blip r:embed="rId13"/>
                     <a:stretch>
                       <a:fillRect/>
                     </a:stretch>
@@ -1699,7 +1793,7 @@
                     <pic:cNvPicPr/>
                   </pic:nvPicPr>
                   <pic:blipFill>
-                    <a:blip r:embed="rId13"/>
+                    <a:blip r:embed="rId14"/>
                     <a:stretch>
                       <a:fillRect/>
                     </a:stretch>
@@ -1771,7 +1865,7 @@
                     <pic:cNvPicPr/>
                   </pic:nvPicPr>
                   <pic:blipFill>
-                    <a:blip r:embed="rId14"/>
+                    <a:blip r:embed="rId15"/>
                     <a:stretch>
                       <a:fillRect/>
                     </a:stretch>
@@ -1843,8 +1937,21 @@
     </w:p>
     <w:p>
       <w:r>
-        <w:t>source /opt/ros/humble/setup.bash</w:t>
-      </w:r>
+        <w:t>source /opt/</w:t>
+      </w:r>
+      <w:proofErr w:type="spellStart"/>
+      <w:r>
+        <w:t>ros</w:t>
+      </w:r>
+      <w:proofErr w:type="spellEnd"/>
+      <w:r>
+        <w:t>/humble/</w:t>
+      </w:r>
+      <w:proofErr w:type="spellStart"/>
+      <w:r>
+        <w:t>setup.bash</w:t>
+      </w:r>
+      <w:proofErr w:type="spellEnd"/>
     </w:p>
     <w:p>
       <w:r>
@@ -1896,13 +2003,31 @@
     </w:p>
     <w:p>
       <w:r>
-        <w:t>source /opt/ros/humble/setup.bash</w:t>
-      </w:r>
-    </w:p>
-    <w:p>
-      <w:r>
-        <w:t>source ~/Zhang_25252980_EE650_ws/install/setup.bash</w:t>
-      </w:r>
+        <w:t>source /opt/</w:t>
+      </w:r>
+      <w:proofErr w:type="spellStart"/>
+      <w:r>
+        <w:t>ros</w:t>
+      </w:r>
+      <w:proofErr w:type="spellEnd"/>
+      <w:r>
+        <w:t>/humble/</w:t>
+      </w:r>
+      <w:proofErr w:type="spellStart"/>
+      <w:r>
+        <w:t>setup.bash</w:t>
+      </w:r>
+      <w:proofErr w:type="spellEnd"/>
+    </w:p>
+    <w:p>
+      <w:r>
+        <w:t>source ~/Zhang_25252980_EE650_ws/install/</w:t>
+      </w:r>
+      <w:proofErr w:type="spellStart"/>
+      <w:r>
+        <w:t>setup.bash</w:t>
+      </w:r>
+      <w:proofErr w:type="spellEnd"/>
     </w:p>
     <w:p>
       <w:r>
@@ -1926,17 +2051,62 @@
     </w:p>
     <w:p>
       <w:r>
-        <w:t>source /opt/ros/humble/setup.bash</w:t>
-      </w:r>
-    </w:p>
-    <w:p>
-      <w:r>
-        <w:t>ros2 service call /domain_expert/get_domain \</w:t>
-      </w:r>
-    </w:p>
-    <w:p>
-      <w:r>
-        <w:t xml:space="preserve">  plansys2_msgs/srv/GetDomain {}</w:t>
+        <w:t>source /opt/</w:t>
+      </w:r>
+      <w:proofErr w:type="spellStart"/>
+      <w:r>
+        <w:t>ros</w:t>
+      </w:r>
+      <w:proofErr w:type="spellEnd"/>
+      <w:r>
+        <w:t>/humble/</w:t>
+      </w:r>
+      <w:proofErr w:type="spellStart"/>
+      <w:r>
+        <w:t>setup.bash</w:t>
+      </w:r>
+      <w:proofErr w:type="spellEnd"/>
+    </w:p>
+    <w:p>
+      <w:r>
+        <w:t>ros2 service call /</w:t>
+      </w:r>
+      <w:proofErr w:type="spellStart"/>
+      <w:r>
+        <w:t>domain_expert</w:t>
+      </w:r>
+      <w:proofErr w:type="spellEnd"/>
+      <w:r>
+        <w:t>/</w:t>
+      </w:r>
+      <w:proofErr w:type="spellStart"/>
+      <w:r>
+        <w:t>get_domain</w:t>
+      </w:r>
+      <w:proofErr w:type="spellEnd"/>
+      <w:r>
+        <w:t xml:space="preserve"> \</w:t>
+      </w:r>
+    </w:p>
+    <w:p>
+      <w:r>
+        <w:t xml:space="preserve">  plansys2_msgs/</w:t>
+      </w:r>
+      <w:proofErr w:type="spellStart"/>
+      <w:r>
+        <w:t>srv</w:t>
+      </w:r>
+      <w:proofErr w:type="spellEnd"/>
+      <w:r>
+        <w:t>/</w:t>
+      </w:r>
+      <w:proofErr w:type="spellStart"/>
+      <w:r>
+        <w:t>GetDomain</w:t>
+      </w:r>
+      <w:proofErr w:type="spellEnd"/>
+      <w:r>
+        <w:t xml:space="preserve"> {}</w:t>
       </w:r>
     </w:p>
     <w:p>
@@ -1978,13 +2148,31 @@
     </w:p>
     <w:p>
       <w:r>
-        <w:t>source /opt/ros/humble/setup.bash</w:t>
-      </w:r>
-    </w:p>
-    <w:p>
-      <w:r>
-        <w:t>source ~/Zhang_25252980_EE650_ws/install/setup.bash</w:t>
-      </w:r>
+        <w:t>source /opt/</w:t>
+      </w:r>
+      <w:proofErr w:type="spellStart"/>
+      <w:r>
+        <w:t>ros</w:t>
+      </w:r>
+      <w:proofErr w:type="spellEnd"/>
+      <w:r>
+        <w:t>/humble/</w:t>
+      </w:r>
+      <w:proofErr w:type="spellStart"/>
+      <w:r>
+        <w:t>setup.bash</w:t>
+      </w:r>
+      <w:proofErr w:type="spellEnd"/>
+    </w:p>
+    <w:p>
+      <w:r>
+        <w:t>source ~/Zhang_25252980_EE650_ws/install/</w:t>
+      </w:r>
+      <w:proofErr w:type="spellStart"/>
+      <w:r>
+        <w:t>setup.bash</w:t>
+      </w:r>
+      <w:proofErr w:type="spellEnd"/>
     </w:p>
     <w:p>
       <w:r>
@@ -2004,7 +2192,15 @@
     </w:p>
     <w:p>
       <w:r>
-        <w:t xml:space="preserve">  use_sim_time:=True</w:t>
+        <w:t xml:space="preserve">  </w:t>
+      </w:r>
+      <w:proofErr w:type="spellStart"/>
+      <w:r>
+        <w:t>use_sim_time</w:t>
+      </w:r>
+      <w:proofErr w:type="spellEnd"/>
+      <w:r>
+        <w:t>:=True</w:t>
       </w:r>
     </w:p>
     <w:p>
@@ -2448,6 +2644,7 @@
   <w:style w:type="character" w:default="1" w:styleId="DefaultParagraphFont">
     <w:name w:val="Default Paragraph Font"/>
     <w:uiPriority w:val="1"/>
+    <w:semiHidden/>
     <w:unhideWhenUsed/>
   </w:style>
   <w:style w:type="table" w:default="1" w:styleId="TableNormal">

</xml_diff>